<commit_message>
chore: update supplement index links to anonymous mirror for review
</commit_message>
<xml_diff>
--- a/supplements/Supplementary_Materials_Index.docx
+++ b/supplements/Supplementary_Materials_Index.docx
@@ -46,7 +46,7 @@
         </w:rPr>
         <w:t xml:space="preserve">Repository: </w:t>
       </w:r>
-      <w:hyperlink w:history="1" r:id="rIdbqtn6mny3tosvz9_blwqs">
+      <w:hyperlink w:history="1" r:id="rId3wysn4vfhz4qhxnm43kb6">
         <w:r>
           <w:rPr>
             <w:rStyle w:val="Hyperlink"/>
@@ -54,7 +54,7 @@
             <w:sz w:val="20"/>
             <w:szCs w:val="20"/>
           </w:rPr>
-          <w:t xml:space="preserve">https://github.com/tsedbrpp/scratch</w:t>
+          <w:t xml:space="preserve">https://anonymous.4open.science/r/scratch-41CE</w:t>
         </w:r>
       </w:hyperlink>
       <w:r>
@@ -66,7 +66,7 @@
         </w:rPr>
         <w:t xml:space="preserve">  |  Supplements: </w:t>
       </w:r>
-      <w:hyperlink w:history="1" r:id="rIdprrye2oysjcbmmw4igr6c">
+      <w:hyperlink w:history="1" r:id="rIdqraxxu1cetgbfgbf6fg3e">
         <w:r>
           <w:rPr>
             <w:rStyle w:val="Hyperlink"/>
@@ -74,7 +74,7 @@
             <w:sz w:val="20"/>
             <w:szCs w:val="20"/>
           </w:rPr>
-          <w:t xml:space="preserve">https://github.com/tsedbrpp/scratch/tree/main/supplements</w:t>
+          <w:t xml:space="preserve">https://anonymous.4open.science/r/scratch-41CE/supplements</w:t>
         </w:r>
       </w:hyperlink>
     </w:p>
@@ -263,7 +263,7 @@
             <w:shd w:fill="FFFFFF"/>
           </w:tcPr>
           <w:p>
-            <w:hyperlink w:history="1" r:id="rIdf2ynrsse94elp9rkj2wdl">
+            <w:hyperlink w:history="1" r:id="rIdfrl7ywcag6rkgpvnk1ofv">
               <w:r>
                 <w:rPr>
                   <w:rStyle w:val="Hyperlink"/>
@@ -330,7 +330,7 @@
             <w:shd w:fill="F2F2F2"/>
           </w:tcPr>
           <w:p>
-            <w:hyperlink w:history="1" r:id="rIdhhhy8alnb5rftubpket1t">
+            <w:hyperlink w:history="1" r:id="rIdgxwmbv3kbdlfwts9koslv">
               <w:r>
                 <w:rPr>
                   <w:rStyle w:val="Hyperlink"/>
@@ -397,7 +397,7 @@
             <w:shd w:fill="FFFFFF"/>
           </w:tcPr>
           <w:p>
-            <w:hyperlink w:history="1" r:id="rIdpex__azbtdynpplnjto7i">
+            <w:hyperlink w:history="1" r:id="rIdqbkdbjnc9k8orqah4fq7d">
               <w:r>
                 <w:rPr>
                   <w:rStyle w:val="Hyperlink"/>
@@ -464,7 +464,7 @@
             <w:shd w:fill="F2F2F2"/>
           </w:tcPr>
           <w:p>
-            <w:hyperlink w:history="1" r:id="rIdk__hmvkulmqyxiaspud3j">
+            <w:hyperlink w:history="1" r:id="rIdpychvnbjb1b2z-xskonb3">
               <w:r>
                 <w:rPr>
                   <w:rStyle w:val="Hyperlink"/>
@@ -531,7 +531,7 @@
             <w:shd w:fill="FFFFFF"/>
           </w:tcPr>
           <w:p>
-            <w:hyperlink w:history="1" r:id="rId8jiphtkd6mnyoihtxg_6j">
+            <w:hyperlink w:history="1" r:id="rIdoj18fpjz7fxvb8d6awnfv">
               <w:r>
                 <w:rPr>
                   <w:rStyle w:val="Hyperlink"/>
@@ -598,7 +598,7 @@
             <w:shd w:fill="F2F2F2"/>
           </w:tcPr>
           <w:p>
-            <w:hyperlink w:history="1" r:id="rIdphobft53yf26bqqjtztlo">
+            <w:hyperlink w:history="1" r:id="rIdeow28iu6olfyetj2g7pi4">
               <w:r>
                 <w:rPr>
                   <w:rStyle w:val="Hyperlink"/>
@@ -685,7 +685,7 @@
             <w:shd w:fill="FFFFFF"/>
           </w:tcPr>
           <w:p>
-            <w:hyperlink w:history="1" r:id="rIdp7rfobjvmkcbgixw_ockg">
+            <w:hyperlink w:history="1" r:id="rIdwo48perd5igzjmvkjqpj8">
               <w:r>
                 <w:rPr>
                   <w:rStyle w:val="Hyperlink"/>
@@ -752,7 +752,7 @@
             <w:shd w:fill="F2F2F2"/>
           </w:tcPr>
           <w:p>
-            <w:hyperlink w:history="1" r:id="rIdktc0bsyq8tqq7tg2soxl7">
+            <w:hyperlink w:history="1" r:id="rIdw_bp-5ltdoticev8bbxw8">
               <w:r>
                 <w:rPr>
                   <w:rStyle w:val="Hyperlink"/>
@@ -819,7 +819,7 @@
             <w:shd w:fill="FFFFFF"/>
           </w:tcPr>
           <w:p>
-            <w:hyperlink w:history="1" r:id="rIdnsm9vd3fu0kny8xmhnpsh">
+            <w:hyperlink w:history="1" r:id="rIdpy1fstblwkvrlsvrsbphm">
               <w:r>
                 <w:rPr>
                   <w:rStyle w:val="Hyperlink"/>
@@ -897,16 +897,16 @@
                 <w:sz w:val="20"/>
                 <w:szCs w:val="20"/>
               </w:rPr>
-              <w:t xml:space="preserve">Mermaid-based architecture diagram illustrating the end-to-end analytical pipeline: researcher interaction, document ingestion, LLM ensemble orchestration (GPT-4o, GPT-4o-mini, Gemini 1.5 Flash), eight-layer analysis, GNDP pipeline, TST/TLF meta-synthesis, and export. Accompanied by a rendered PNG.</w:t>
-            </w:r>
-          </w:p>
-        </w:tc>
-        <w:tc>
-          <w:tcPr>
-            <w:shd w:fill="F2F2F2"/>
-          </w:tcPr>
-          <w:p>
-            <w:hyperlink w:history="1" r:id="rIdtaydw1rdr9sntntjq7mry">
+              <w:t xml:space="preserve">Mermaid-based architecture diagram illustrating the end-to-end analytical pipeline: researcher interaction, document ingestion, LLM ensemble orchestration (GPT-4o, GPT-4o-mini, Gemini 1.5 Flash), eight-layer analysis, GNDP pipeline, TLF meta-synthesis, and export. Accompanied by a rendered PNG.</w:t>
+            </w:r>
+          </w:p>
+        </w:tc>
+        <w:tc>
+          <w:tcPr>
+            <w:shd w:fill="F2F2F2"/>
+          </w:tcPr>
+          <w:p>
+            <w:hyperlink w:history="1" r:id="rIdgrckzrrokfpqc50szdf1w">
               <w:r>
                 <w:rPr>
                   <w:rStyle w:val="Hyperlink"/>
@@ -973,7 +973,7 @@
             <w:shd w:fill="FFFFFF"/>
           </w:tcPr>
           <w:p>
-            <w:hyperlink w:history="1" r:id="rIdit2h_4jghexb5l4gzji4d">
+            <w:hyperlink w:history="1" r:id="rId3xg52ti5csrglea-nxfjn">
               <w:r>
                 <w:rPr>
                   <w:rStyle w:val="Hyperlink"/>
@@ -1040,7 +1040,7 @@
             <w:shd w:fill="F2F2F2"/>
           </w:tcPr>
           <w:p>
-            <w:hyperlink w:history="1" r:id="rIdlw5n04sqn-zlsma4p13lx">
+            <w:hyperlink w:history="1" r:id="rIde3a-sz_l8vn-7fa2roucy">
               <w:r>
                 <w:rPr>
                   <w:rStyle w:val="Hyperlink"/>
@@ -1118,16 +1118,16 @@
                 <w:sz w:val="20"/>
                 <w:szCs w:val="20"/>
               </w:rPr>
-              <w:t xml:space="preserve">High-level overview of Policy Prism's core capabilities: multi-lens algorithmic analysis, GNDP v1.0, ecosystem mapping, Translational Stratification Theory, comparative synthesis, and empirical grounding. Includes design principles (traceability, contestability, productive friction).</w:t>
-            </w:r>
-          </w:p>
-        </w:tc>
-        <w:tc>
-          <w:tcPr>
-            <w:shd w:fill="FFFFFF"/>
-          </w:tcPr>
-          <w:p>
-            <w:hyperlink w:history="1" r:id="rIdxni7otg2y_emqup4rdqdb">
+              <w:t xml:space="preserve">High-level overview of Policy Prism's core capabilities: multi-lens algorithmic analysis, GNDP v1.0, ecosystem mapping, Translational Legibility Framework, comparative synthesis, and empirical grounding. Includes design principles (traceability, contestability, productive friction).</w:t>
+            </w:r>
+          </w:p>
+        </w:tc>
+        <w:tc>
+          <w:tcPr>
+            <w:shd w:fill="FFFFFF"/>
+          </w:tcPr>
+          <w:p>
+            <w:hyperlink w:history="1" r:id="rIdxn3o683l7-llanrox3rjy">
               <w:r>
                 <w:rPr>
                   <w:rStyle w:val="Hyperlink"/>
@@ -1194,7 +1194,7 @@
             <w:shd w:fill="F2F2F2"/>
           </w:tcPr>
           <w:p>
-            <w:hyperlink w:history="1" r:id="rIdk1tscyx-bhetgsglxotcl">
+            <w:hyperlink w:history="1" r:id="rIdlr8qmqvmuqijqxoy4xttj">
               <w:r>
                 <w:rPr>
                   <w:rStyle w:val="Hyperlink"/>
@@ -1252,16 +1252,16 @@
                 <w:sz w:val="20"/>
                 <w:szCs w:val="20"/>
               </w:rPr>
-              <w:t xml:space="preserve">Recommended five-phase research workflow: Data Collection → Micro Analysis (per-document extraction) → Meso Analysis (ecosystem mapping, GNDP, ontology) → Macro Analysis (cultural framing, structural analysis, critique) → Synthesis (comparative, TST meta-synthesis, reporting).</w:t>
-            </w:r>
-          </w:p>
-        </w:tc>
-        <w:tc>
-          <w:tcPr>
-            <w:shd w:fill="FFFFFF"/>
-          </w:tcPr>
-          <w:p>
-            <w:hyperlink w:history="1" r:id="rIdxz9nzsyacvcnuhiebbhgu">
+              <w:t xml:space="preserve">Recommended five-phase research workflow: Data Collection → Micro Analysis (per-document extraction) → Meso Analysis (ecosystem mapping, GNDP, ontology) → Macro Analysis (cultural framing, structural analysis, critique) → Synthesis (comparative, TLF meta-synthesis, reporting).</w:t>
+            </w:r>
+          </w:p>
+        </w:tc>
+        <w:tc>
+          <w:tcPr>
+            <w:shd w:fill="FFFFFF"/>
+          </w:tcPr>
+          <w:p>
+            <w:hyperlink w:history="1" r:id="rId4fpt2zmhy-h6k9x0o7lvy">
               <w:r>
                 <w:rPr>
                   <w:rStyle w:val="Hyperlink"/>
@@ -1319,16 +1319,16 @@
                 <w:sz w:val="20"/>
                 <w:szCs w:val="20"/>
               </w:rPr>
-              <w:t xml:space="preserve">Comprehensive user manual covering account creation, data management, analysis modes (12+), ecosystem map visualisation, GNDP pipeline operation, analyst reflexive assessment, TST meta-synthesis, comparative analysis, DOCX/JSON/CSV export, credits/billing, and FAQ.</w:t>
-            </w:r>
-          </w:p>
-        </w:tc>
-        <w:tc>
-          <w:tcPr>
-            <w:shd w:fill="F2F2F2"/>
-          </w:tcPr>
-          <w:p>
-            <w:hyperlink w:history="1" r:id="rIdx_ju3vcmzlbfvnm14lwh4">
+              <w:t xml:space="preserve">Comprehensive user manual covering account creation, data management, analysis modes (12+), ecosystem map visualisation, GNDP pipeline operation, analyst reflexive assessment, TLF meta-synthesis, comparative analysis, DOCX/JSON/CSV export, credits/billing, and FAQ.</w:t>
+            </w:r>
+          </w:p>
+        </w:tc>
+        <w:tc>
+          <w:tcPr>
+            <w:shd w:fill="F2F2F2"/>
+          </w:tcPr>
+          <w:p>
+            <w:hyperlink w:history="1" r:id="rIdftzlee_sleqza-3egyhm8">
               <w:r>
                 <w:rPr>
                   <w:rStyle w:val="Hyperlink"/>
@@ -1395,7 +1395,7 @@
             <w:shd w:fill="FFFFFF"/>
           </w:tcPr>
           <w:p>
-            <w:hyperlink w:history="1" r:id="rId_ixtart9fvmwndg4fom3l">
+            <w:hyperlink w:history="1" r:id="rId-fxe3gojzf8zsunfeiuln">
               <w:r>
                 <w:rPr>
                   <w:rStyle w:val="Hyperlink"/>
@@ -1453,16 +1453,16 @@
                 <w:sz w:val="20"/>
                 <w:szCs w:val="20"/>
               </w:rPr>
-              <w:t xml:space="preserve">Step-by-step quick start for running a first analysis in under five minutes: sign in, upload document, run analysis, detect ghost nodes, explore ecosystem, compare documents, generate TST meta-synthesis, and export results.</w:t>
-            </w:r>
-          </w:p>
-        </w:tc>
-        <w:tc>
-          <w:tcPr>
-            <w:shd w:fill="F2F2F2"/>
-          </w:tcPr>
-          <w:p>
-            <w:hyperlink w:history="1" r:id="rIddiio31v-yxvvo5yajh5x0">
+              <w:t xml:space="preserve">Step-by-step quick start for running a first analysis in under five minutes: sign in, upload document, run analysis, detect ghost nodes, explore ecosystem, compare documents, generate TLF meta-synthesis, and export results.</w:t>
+            </w:r>
+          </w:p>
+        </w:tc>
+        <w:tc>
+          <w:tcPr>
+            <w:shd w:fill="F2F2F2"/>
+          </w:tcPr>
+          <w:p>
+            <w:hyperlink w:history="1" r:id="rIde2nfd5kyej3qvodwujpvq">
               <w:r>
                 <w:rPr>
                   <w:rStyle w:val="Hyperlink"/>
@@ -1529,7 +1529,7 @@
             <w:shd w:fill="FFFFFF"/>
           </w:tcPr>
           <w:p>
-            <w:hyperlink w:history="1" r:id="rIdyjqyjcs5dqwo4ssha9wnd">
+            <w:hyperlink w:history="1" r:id="rIdsfjfeanbxg4sra5iqe5nr">
               <w:r>
                 <w:rPr>
                   <w:rStyle w:val="Hyperlink"/>
@@ -1596,7 +1596,7 @@
             <w:shd w:fill="F2F2F2"/>
           </w:tcPr>
           <w:p>
-            <w:hyperlink w:history="1" r:id="rIdj1g-q-qvpi2cdsqoheynq">
+            <w:hyperlink w:history="1" r:id="rId8jsvpcvzfekvjoa3ach79">
               <w:r>
                 <w:rPr>
                   <w:rStyle w:val="Hyperlink"/>
@@ -1663,7 +1663,7 @@
             <w:shd w:fill="FFFFFF"/>
           </w:tcPr>
           <w:p>
-            <w:hyperlink w:history="1" r:id="rIdwwykneftp8qaslqr7yp2f">
+            <w:hyperlink w:history="1" r:id="rId1yn3a4b0sj7jc6bmxgkgw">
               <w:r>
                 <w:rPr>
                   <w:rStyle w:val="Hyperlink"/>
@@ -1750,7 +1750,7 @@
             <w:shd w:fill="F2F2F2"/>
           </w:tcPr>
           <w:p>
-            <w:hyperlink w:history="1" r:id="rId2a1wfuuih-3tbi2ig4ikl">
+            <w:hyperlink w:history="1" r:id="rId0rbts3ayskgungy3ckfeh">
               <w:r>
                 <w:rPr>
                   <w:rStyle w:val="Hyperlink"/>

</xml_diff>